<commit_message>
Add Mermaid-backed PDD diagram export foundation
</commit_message>
<xml_diff>
--- a/test-assets/pdd-enterprise-multishot-template.docx
+++ b/test-assets/pdd-enterprise-multishot-template.docx
@@ -189,7 +189,64 @@
     </w:p>
     <w:p>
       <w:r>
-        <w:t xml:space="preserve">4. Business Rules and Notes</w:t>
+        <w:t xml:space="preserve">4. TO-BE Suggestions</w:t>
+      </w:r>
+    </w:p>
+    <w:p>
+      <w:r>
+        <w:t xml:space="preserve">{% for item in pdd.to_be_recommendations %}</w:t>
+      </w:r>
+    </w:p>
+    <w:p>
+      <w:r>
+        <w:t xml:space="preserve">- {{ item.title }}: {{ item.recommendation }}</w:t>
+      </w:r>
+    </w:p>
+    <w:p>
+      <w:r>
+        <w:t xml:space="preserve">{% endfor %}</w:t>
+      </w:r>
+    </w:p>
+    <w:p/>
+    <w:p>
+      <w:r>
+        <w:t xml:space="preserve">5. Process Flow Diagram</w:t>
+      </w:r>
+    </w:p>
+    <w:p>
+      <w:r>
+        <w:t xml:space="preserve">{% if pdd.process_flow.diagram_image %}</w:t>
+      </w:r>
+    </w:p>
+    <w:p>
+      <w:r>
+        <w:t xml:space="preserve">{{ pdd.process_flow.diagram_image }}</w:t>
+      </w:r>
+    </w:p>
+    <w:p>
+      <w:r>
+        <w:t xml:space="preserve">{% else %}</w:t>
+      </w:r>
+    </w:p>
+    <w:p>
+      <w:r>
+        <w:t xml:space="preserve">Mermaid Source:</w:t>
+      </w:r>
+    </w:p>
+    <w:p>
+      <w:r>
+        <w:t xml:space="preserve">{{ pdd.process_flow.mermaid_source }}</w:t>
+      </w:r>
+    </w:p>
+    <w:p>
+      <w:r>
+        <w:t xml:space="preserve">{% endif %}</w:t>
+      </w:r>
+    </w:p>
+    <w:p/>
+    <w:p>
+      <w:r>
+        <w:t xml:space="preserve">6. Business Rules and Notes</w:t>
       </w:r>
     </w:p>
     <w:p>

</xml_diff>

<commit_message>
Implement session detail workflow and diagram editor improvements
</commit_message>
<xml_diff>
--- a/test-assets/pdd-enterprise-multishot-template.docx
+++ b/test-assets/pdd-enterprise-multishot-template.docx
@@ -262,6 +262,36 @@
     <w:p>
       <w:r>
         <w:t xml:space="preserve">{% endfor %}</w:t>
+      </w:r>
+    </w:p>
+    <w:p>
+      <w:r>
+        <w:t>6. Detailed Flow Diagram</w:t>
+      </w:r>
+    </w:p>
+    <w:p>
+      <w:r>
+        <w:t>{% if pdd.process_flow.detailed_image %}</w:t>
+      </w:r>
+    </w:p>
+    <w:p>
+      <w:r>
+        <w:t>{{ pdd.process_flow.detailed_image }}</w:t>
+      </w:r>
+    </w:p>
+    <w:p>
+      <w:r>
+        <w:t>{% else %}</w:t>
+      </w:r>
+    </w:p>
+    <w:p>
+      <w:r>
+        <w:t>{{ pdd.process_flow.diagram_source }}</w:t>
+      </w:r>
+    </w:p>
+    <w:p>
+      <w:r>
+        <w:t>{% endif %}</w:t>
       </w:r>
     </w:p>
     <w:sectPr>

</xml_diff>